<commit_message>
Mise à jour des cartes et des pistes de scores fr+en
</commit_message>
<xml_diff>
--- a/pictures/Score-Track-en/Score-Track.docx
+++ b/pictures/Score-Track-en/Score-Track.docx
@@ -804,17 +804,14 @@
         <w:jc w:val="center"/>
       </w:pPr>
       <w:r>
+        <w:rPr>
+          <w:noProof/>
+        </w:rPr>
         <w:drawing>
-          <wp:inline distT="0" distB="0" distL="0" distR="0" wp14:anchorId="23104979" wp14:editId="42DF68F8">
-            <wp:extent cx="7968163" cy="5078408"/>
+          <wp:inline distT="0" distB="0" distL="0" distR="0" wp14:anchorId="5B4160B2" wp14:editId="3255B94E">
+            <wp:extent cx="7967980" cy="5078095"/>
             <wp:effectExtent l="0" t="0" r="0" b="8255"/>
-            <wp:docPr id="4" name="Image 3">
-              <a:extLst xmlns:a="http://schemas.openxmlformats.org/drawingml/2006/main">
-                <a:ext uri="{FF2B5EF4-FFF2-40B4-BE49-F238E27FC236}">
-                  <a16:creationId xmlns:a16="http://schemas.microsoft.com/office/drawing/2014/main" id="{9156F4B5-97AB-CE35-4567-9E1955EC9BB7}"/>
-                </a:ext>
-              </a:extLst>
-            </wp:docPr>
+            <wp:docPr id="1615775794" name="Image 1"/>
             <wp:cNvGraphicFramePr>
               <a:graphicFrameLocks xmlns:a="http://schemas.openxmlformats.org/drawingml/2006/main" noChangeAspect="1"/>
             </wp:cNvGraphicFramePr>
@@ -822,31 +819,33 @@
               <a:graphicData uri="http://schemas.openxmlformats.org/drawingml/2006/picture">
                 <pic:pic xmlns:pic="http://schemas.openxmlformats.org/drawingml/2006/picture">
                   <pic:nvPicPr>
-                    <pic:cNvPr id="4" name="Image 3">
-                      <a:extLst>
-                        <a:ext uri="{FF2B5EF4-FFF2-40B4-BE49-F238E27FC236}">
-                          <a16:creationId xmlns:a16="http://schemas.microsoft.com/office/drawing/2014/main" id="{9156F4B5-97AB-CE35-4567-9E1955EC9BB7}"/>
-                        </a:ext>
-                      </a:extLst>
-                    </pic:cNvPr>
+                    <pic:cNvPr id="0" name="Picture 2"/>
                     <pic:cNvPicPr>
-                      <a:picLocks noChangeAspect="1"/>
+                      <a:picLocks noChangeAspect="1" noChangeArrowheads="1"/>
                     </pic:cNvPicPr>
                   </pic:nvPicPr>
                   <pic:blipFill>
-                    <a:blip r:embed="rId41"/>
+                    <a:blip r:embed="rId41">
+                      <a:extLst>
+                        <a:ext uri="{28A0092B-C50C-407E-A947-70E740481C1C}">
+                          <a14:useLocalDpi xmlns:a14="http://schemas.microsoft.com/office/drawing/2010/main" val="0"/>
+                        </a:ext>
+                      </a:extLst>
+                    </a:blip>
+                    <a:srcRect/>
                     <a:stretch>
                       <a:fillRect/>
                     </a:stretch>
                   </pic:blipFill>
-                  <pic:spPr>
+                  <pic:spPr bwMode="auto">
                     <a:xfrm>
                       <a:off x="0" y="0"/>
-                      <a:ext cx="7968163" cy="5078408"/>
+                      <a:ext cx="7967980" cy="5078095"/>
                     </a:xfrm>
                     <a:prstGeom prst="rect">
                       <a:avLst/>
                     </a:prstGeom>
+                    <a:noFill/>
                   </pic:spPr>
                 </pic:pic>
               </a:graphicData>
@@ -1588,6 +1587,7 @@
   <w:style w:type="character" w:default="1" w:styleId="Policepardfaut">
     <w:name w:val="Default Paragraph Font"/>
     <w:uiPriority w:val="1"/>
+    <w:semiHidden/>
     <w:unhideWhenUsed/>
   </w:style>
   <w:style w:type="table" w:default="1" w:styleId="TableauNormal">

</xml_diff>